<commit_message>
feat(templates): 规则集反推支持 styles.xml 命名样式层叠（issue #28）
- rulesetFromSample 解析 word/styles.xml 建立 styleId→段落/字符属性映射
  （含 basedOn 链，子覆盖父、带环保护）；段落提取按 Word 层叠：
  命名样式属性垫底，直接格式（pPr / 首个含文本 run 的 rPr）覆盖
- 补 caption/heading1-4/attachment 维度：用默认规则集 regex 识别规则
  在样例表外段落取样；补 table 维度：首个表格数据行首格取样
  （字体/字号/对齐，避开表头行）
- schema 允许表格组件 align 键
- lab-report fixture 模板新增 TableCell 命名样式（数据行单元格只挂
  pStyle），重新生成 template.docx/messy-draft.docx
- 新增测试：fixture 反推断言 caption=黑体14pt居中、body=仿宋16pt两端
  对齐28磅行距首行缩进2字符、heading1=黑体16pt、table=仿宋12pt居中；
  直接格式优先于 pStyle 的层叠优先级测试
</commit_message>
<xml_diff>
--- a/test/fixtures/lab-report/template.docx
+++ b/test/fixtures/lab-report/template.docx
@@ -311,19 +311,9 @@
           </w:tcPr>
           <w:p>
             <w:pPr>
-              <w:jc w:val="center"/>
-              <w:rPr>
-                <w:rFonts w:ascii="Times New Roman" w:eastAsia="仿宋_GB2312" w:hAnsi="Times New Roman"/>
-                <w:sz w:val="24"/>
-                <w:szCs w:val="24"/>
-              </w:rPr>
-            </w:pPr>
-            <w:r>
-              <w:rPr>
-                <w:rFonts w:ascii="Times New Roman" w:eastAsia="仿宋_GB2312" w:hAnsi="Times New Roman"/>
-                <w:sz w:val="24"/>
-                <w:szCs w:val="24"/>
-              </w:rPr>
+              <w:pStyle w:val="TableCell"/>
+            </w:pPr>
+            <w:r>
               <w:t xml:space="preserve">1</w:t>
             </w:r>
           </w:p>
@@ -335,19 +325,9 @@
           </w:tcPr>
           <w:p>
             <w:pPr>
-              <w:jc w:val="center"/>
-              <w:rPr>
-                <w:rFonts w:ascii="Times New Roman" w:eastAsia="仿宋_GB2312" w:hAnsi="Times New Roman"/>
-                <w:sz w:val="24"/>
-                <w:szCs w:val="24"/>
-              </w:rPr>
-            </w:pPr>
-            <w:r>
-              <w:rPr>
-                <w:rFonts w:ascii="Times New Roman" w:eastAsia="仿宋_GB2312" w:hAnsi="Times New Roman"/>
-                <w:sz w:val="24"/>
-                <w:szCs w:val="24"/>
-              </w:rPr>
+              <w:pStyle w:val="TableCell"/>
+            </w:pPr>
+            <w:r>
               <w:t xml:space="preserve">50.5</w:t>
             </w:r>
           </w:p>
@@ -359,19 +339,9 @@
           </w:tcPr>
           <w:p>
             <w:pPr>
-              <w:jc w:val="center"/>
-              <w:rPr>
-                <w:rFonts w:ascii="Times New Roman" w:eastAsia="仿宋_GB2312" w:hAnsi="Times New Roman"/>
-                <w:sz w:val="24"/>
-                <w:szCs w:val="24"/>
-              </w:rPr>
-            </w:pPr>
-            <w:r>
-              <w:rPr>
-                <w:rFonts w:ascii="Times New Roman" w:eastAsia="仿宋_GB2312" w:hAnsi="Times New Roman"/>
-                <w:sz w:val="24"/>
-                <w:szCs w:val="24"/>
-              </w:rPr>
+              <w:pStyle w:val="TableCell"/>
+            </w:pPr>
+            <w:r>
               <w:t xml:space="preserve">1.43</w:t>
             </w:r>
           </w:p>
@@ -383,19 +353,9 @@
           </w:tcPr>
           <w:p>
             <w:pPr>
-              <w:jc w:val="center"/>
-              <w:rPr>
-                <w:rFonts w:ascii="Times New Roman" w:eastAsia="仿宋_GB2312" w:hAnsi="Times New Roman"/>
-                <w:sz w:val="24"/>
-                <w:szCs w:val="24"/>
-              </w:rPr>
-            </w:pPr>
-            <w:r>
-              <w:rPr>
-                <w:rFonts w:ascii="Times New Roman" w:eastAsia="仿宋_GB2312" w:hAnsi="Times New Roman"/>
-                <w:sz w:val="24"/>
-                <w:szCs w:val="24"/>
-              </w:rPr>
+              <w:pStyle w:val="TableCell"/>
+            </w:pPr>
+            <w:r>
               <w:t xml:space="preserve">9.75</w:t>
             </w:r>
           </w:p>
@@ -409,19 +369,9 @@
           </w:tcPr>
           <w:p>
             <w:pPr>
-              <w:jc w:val="center"/>
-              <w:rPr>
-                <w:rFonts w:ascii="Times New Roman" w:eastAsia="仿宋_GB2312" w:hAnsi="Times New Roman"/>
-                <w:sz w:val="24"/>
-                <w:szCs w:val="24"/>
-              </w:rPr>
-            </w:pPr>
-            <w:r>
-              <w:rPr>
-                <w:rFonts w:ascii="Times New Roman" w:eastAsia="仿宋_GB2312" w:hAnsi="Times New Roman"/>
-                <w:sz w:val="24"/>
-                <w:szCs w:val="24"/>
-              </w:rPr>
+              <w:pStyle w:val="TableCell"/>
+            </w:pPr>
+            <w:r>
               <w:t xml:space="preserve">2</w:t>
             </w:r>
           </w:p>
@@ -433,19 +383,9 @@
           </w:tcPr>
           <w:p>
             <w:pPr>
-              <w:jc w:val="center"/>
-              <w:rPr>
-                <w:rFonts w:ascii="Times New Roman" w:eastAsia="仿宋_GB2312" w:hAnsi="Times New Roman"/>
-                <w:sz w:val="24"/>
-                <w:szCs w:val="24"/>
-              </w:rPr>
-            </w:pPr>
-            <w:r>
-              <w:rPr>
-                <w:rFonts w:ascii="Times New Roman" w:eastAsia="仿宋_GB2312" w:hAnsi="Times New Roman"/>
-                <w:sz w:val="24"/>
-                <w:szCs w:val="24"/>
-              </w:rPr>
+              <w:pStyle w:val="TableCell"/>
+            </w:pPr>
+            <w:r>
               <w:t xml:space="preserve">60.5</w:t>
             </w:r>
           </w:p>
@@ -457,19 +397,9 @@
           </w:tcPr>
           <w:p>
             <w:pPr>
-              <w:jc w:val="center"/>
-              <w:rPr>
-                <w:rFonts w:ascii="Times New Roman" w:eastAsia="仿宋_GB2312" w:hAnsi="Times New Roman"/>
-                <w:sz w:val="24"/>
-                <w:szCs w:val="24"/>
-              </w:rPr>
-            </w:pPr>
-            <w:r>
-              <w:rPr>
-                <w:rFonts w:ascii="Times New Roman" w:eastAsia="仿宋_GB2312" w:hAnsi="Times New Roman"/>
-                <w:sz w:val="24"/>
-                <w:szCs w:val="24"/>
-              </w:rPr>
+              <w:pStyle w:val="TableCell"/>
+            </w:pPr>
+            <w:r>
               <w:t xml:space="preserve">1.56</w:t>
             </w:r>
           </w:p>
@@ -481,19 +411,9 @@
           </w:tcPr>
           <w:p>
             <w:pPr>
-              <w:jc w:val="center"/>
-              <w:rPr>
-                <w:rFonts w:ascii="Times New Roman" w:eastAsia="仿宋_GB2312" w:hAnsi="Times New Roman"/>
-                <w:sz w:val="24"/>
-                <w:szCs w:val="24"/>
-              </w:rPr>
-            </w:pPr>
-            <w:r>
-              <w:rPr>
-                <w:rFonts w:ascii="Times New Roman" w:eastAsia="仿宋_GB2312" w:hAnsi="Times New Roman"/>
-                <w:sz w:val="24"/>
-                <w:szCs w:val="24"/>
-              </w:rPr>
+              <w:pStyle w:val="TableCell"/>
+            </w:pPr>
+            <w:r>
               <w:t xml:space="preserve">9.81</w:t>
             </w:r>
           </w:p>
@@ -507,19 +427,9 @@
           </w:tcPr>
           <w:p>
             <w:pPr>
-              <w:jc w:val="center"/>
-              <w:rPr>
-                <w:rFonts w:ascii="Times New Roman" w:eastAsia="仿宋_GB2312" w:hAnsi="Times New Roman"/>
-                <w:sz w:val="24"/>
-                <w:szCs w:val="24"/>
-              </w:rPr>
-            </w:pPr>
-            <w:r>
-              <w:rPr>
-                <w:rFonts w:ascii="Times New Roman" w:eastAsia="仿宋_GB2312" w:hAnsi="Times New Roman"/>
-                <w:sz w:val="24"/>
-                <w:szCs w:val="24"/>
-              </w:rPr>
+              <w:pStyle w:val="TableCell"/>
+            </w:pPr>
+            <w:r>
               <w:t xml:space="preserve">3</w:t>
             </w:r>
           </w:p>
@@ -531,19 +441,9 @@
           </w:tcPr>
           <w:p>
             <w:pPr>
-              <w:jc w:val="center"/>
-              <w:rPr>
-                <w:rFonts w:ascii="Times New Roman" w:eastAsia="仿宋_GB2312" w:hAnsi="Times New Roman"/>
-                <w:sz w:val="24"/>
-                <w:szCs w:val="24"/>
-              </w:rPr>
-            </w:pPr>
-            <w:r>
-              <w:rPr>
-                <w:rFonts w:ascii="Times New Roman" w:eastAsia="仿宋_GB2312" w:hAnsi="Times New Roman"/>
-                <w:sz w:val="24"/>
-                <w:szCs w:val="24"/>
-              </w:rPr>
+              <w:pStyle w:val="TableCell"/>
+            </w:pPr>
+            <w:r>
               <w:t xml:space="preserve">70.5</w:t>
             </w:r>
           </w:p>
@@ -555,19 +455,9 @@
           </w:tcPr>
           <w:p>
             <w:pPr>
-              <w:jc w:val="center"/>
-              <w:rPr>
-                <w:rFonts w:ascii="Times New Roman" w:eastAsia="仿宋_GB2312" w:hAnsi="Times New Roman"/>
-                <w:sz w:val="24"/>
-                <w:szCs w:val="24"/>
-              </w:rPr>
-            </w:pPr>
-            <w:r>
-              <w:rPr>
-                <w:rFonts w:ascii="Times New Roman" w:eastAsia="仿宋_GB2312" w:hAnsi="Times New Roman"/>
-                <w:sz w:val="24"/>
-                <w:szCs w:val="24"/>
-              </w:rPr>
+              <w:pStyle w:val="TableCell"/>
+            </w:pPr>
+            <w:r>
               <w:t xml:space="preserve">1.68</w:t>
             </w:r>
           </w:p>
@@ -579,19 +469,9 @@
           </w:tcPr>
           <w:p>
             <w:pPr>
-              <w:jc w:val="center"/>
-              <w:rPr>
-                <w:rFonts w:ascii="Times New Roman" w:eastAsia="仿宋_GB2312" w:hAnsi="Times New Roman"/>
-                <w:sz w:val="24"/>
-                <w:szCs w:val="24"/>
-              </w:rPr>
-            </w:pPr>
-            <w:r>
-              <w:rPr>
-                <w:rFonts w:ascii="Times New Roman" w:eastAsia="仿宋_GB2312" w:hAnsi="Times New Roman"/>
-                <w:sz w:val="24"/>
-                <w:szCs w:val="24"/>
-              </w:rPr>
+              <w:pStyle w:val="TableCell"/>
+            </w:pPr>
+            <w:r>
               <w:t xml:space="preserve">9.86</w:t>
             </w:r>
           </w:p>
@@ -605,19 +485,9 @@
           </w:tcPr>
           <w:p>
             <w:pPr>
-              <w:jc w:val="center"/>
-              <w:rPr>
-                <w:rFonts w:ascii="Times New Roman" w:eastAsia="仿宋_GB2312" w:hAnsi="Times New Roman"/>
-                <w:sz w:val="24"/>
-                <w:szCs w:val="24"/>
-              </w:rPr>
-            </w:pPr>
-            <w:r>
-              <w:rPr>
-                <w:rFonts w:ascii="Times New Roman" w:eastAsia="仿宋_GB2312" w:hAnsi="Times New Roman"/>
-                <w:sz w:val="24"/>
-                <w:szCs w:val="24"/>
-              </w:rPr>
+              <w:pStyle w:val="TableCell"/>
+            </w:pPr>
+            <w:r>
               <w:t xml:space="preserve">4</w:t>
             </w:r>
           </w:p>
@@ -629,19 +499,9 @@
           </w:tcPr>
           <w:p>
             <w:pPr>
-              <w:jc w:val="center"/>
-              <w:rPr>
-                <w:rFonts w:ascii="Times New Roman" w:eastAsia="仿宋_GB2312" w:hAnsi="Times New Roman"/>
-                <w:sz w:val="24"/>
-                <w:szCs w:val="24"/>
-              </w:rPr>
-            </w:pPr>
-            <w:r>
-              <w:rPr>
-                <w:rFonts w:ascii="Times New Roman" w:eastAsia="仿宋_GB2312" w:hAnsi="Times New Roman"/>
-                <w:sz w:val="24"/>
-                <w:szCs w:val="24"/>
-              </w:rPr>
+              <w:pStyle w:val="TableCell"/>
+            </w:pPr>
+            <w:r>
               <w:t xml:space="preserve">80.5</w:t>
             </w:r>
           </w:p>
@@ -653,19 +513,9 @@
           </w:tcPr>
           <w:p>
             <w:pPr>
-              <w:jc w:val="center"/>
-              <w:rPr>
-                <w:rFonts w:ascii="Times New Roman" w:eastAsia="仿宋_GB2312" w:hAnsi="Times New Roman"/>
-                <w:sz w:val="24"/>
-                <w:szCs w:val="24"/>
-              </w:rPr>
-            </w:pPr>
-            <w:r>
-              <w:rPr>
-                <w:rFonts w:ascii="Times New Roman" w:eastAsia="仿宋_GB2312" w:hAnsi="Times New Roman"/>
-                <w:sz w:val="24"/>
-                <w:szCs w:val="24"/>
-              </w:rPr>
+              <w:pStyle w:val="TableCell"/>
+            </w:pPr>
+            <w:r>
               <w:t xml:space="preserve">1.79</w:t>
             </w:r>
           </w:p>
@@ -677,19 +527,9 @@
           </w:tcPr>
           <w:p>
             <w:pPr>
-              <w:jc w:val="center"/>
-              <w:rPr>
-                <w:rFonts w:ascii="Times New Roman" w:eastAsia="仿宋_GB2312" w:hAnsi="Times New Roman"/>
-                <w:sz w:val="24"/>
-                <w:szCs w:val="24"/>
-              </w:rPr>
-            </w:pPr>
-            <w:r>
-              <w:rPr>
-                <w:rFonts w:ascii="Times New Roman" w:eastAsia="仿宋_GB2312" w:hAnsi="Times New Roman"/>
-                <w:sz w:val="24"/>
-                <w:szCs w:val="24"/>
-              </w:rPr>
+              <w:pStyle w:val="TableCell"/>
+            </w:pPr>
+            <w:r>
               <w:t xml:space="preserve">9.92</w:t>
             </w:r>
           </w:p>
@@ -703,19 +543,9 @@
           </w:tcPr>
           <w:p>
             <w:pPr>
-              <w:jc w:val="center"/>
-              <w:rPr>
-                <w:rFonts w:ascii="Times New Roman" w:eastAsia="仿宋_GB2312" w:hAnsi="Times New Roman"/>
-                <w:sz w:val="24"/>
-                <w:szCs w:val="24"/>
-              </w:rPr>
-            </w:pPr>
-            <w:r>
-              <w:rPr>
-                <w:rFonts w:ascii="Times New Roman" w:eastAsia="仿宋_GB2312" w:hAnsi="Times New Roman"/>
-                <w:sz w:val="24"/>
-                <w:szCs w:val="24"/>
-              </w:rPr>
+              <w:pStyle w:val="TableCell"/>
+            </w:pPr>
+            <w:r>
               <w:t xml:space="preserve">5</w:t>
             </w:r>
           </w:p>
@@ -727,19 +557,9 @@
           </w:tcPr>
           <w:p>
             <w:pPr>
-              <w:jc w:val="center"/>
-              <w:rPr>
-                <w:rFonts w:ascii="Times New Roman" w:eastAsia="仿宋_GB2312" w:hAnsi="Times New Roman"/>
-                <w:sz w:val="24"/>
-                <w:szCs w:val="24"/>
-              </w:rPr>
-            </w:pPr>
-            <w:r>
-              <w:rPr>
-                <w:rFonts w:ascii="Times New Roman" w:eastAsia="仿宋_GB2312" w:hAnsi="Times New Roman"/>
-                <w:sz w:val="24"/>
-                <w:szCs w:val="24"/>
-              </w:rPr>
+              <w:pStyle w:val="TableCell"/>
+            </w:pPr>
+            <w:r>
               <w:t xml:space="preserve">90.5</w:t>
             </w:r>
           </w:p>
@@ -751,19 +571,9 @@
           </w:tcPr>
           <w:p>
             <w:pPr>
-              <w:jc w:val="center"/>
-              <w:rPr>
-                <w:rFonts w:ascii="Times New Roman" w:eastAsia="仿宋_GB2312" w:hAnsi="Times New Roman"/>
-                <w:sz w:val="24"/>
-                <w:szCs w:val="24"/>
-              </w:rPr>
-            </w:pPr>
-            <w:r>
-              <w:rPr>
-                <w:rFonts w:ascii="Times New Roman" w:eastAsia="仿宋_GB2312" w:hAnsi="Times New Roman"/>
-                <w:sz w:val="24"/>
-                <w:szCs w:val="24"/>
-              </w:rPr>
+              <w:pStyle w:val="TableCell"/>
+            </w:pPr>
+            <w:r>
               <w:t xml:space="preserve">1.91</w:t>
             </w:r>
           </w:p>
@@ -775,19 +585,9 @@
           </w:tcPr>
           <w:p>
             <w:pPr>
-              <w:jc w:val="center"/>
-              <w:rPr>
-                <w:rFonts w:ascii="Times New Roman" w:eastAsia="仿宋_GB2312" w:hAnsi="Times New Roman"/>
-                <w:sz w:val="24"/>
-                <w:szCs w:val="24"/>
-              </w:rPr>
-            </w:pPr>
-            <w:r>
-              <w:rPr>
-                <w:rFonts w:ascii="Times New Roman" w:eastAsia="仿宋_GB2312" w:hAnsi="Times New Roman"/>
-                <w:sz w:val="24"/>
-                <w:szCs w:val="24"/>
-              </w:rPr>
+              <w:pStyle w:val="TableCell"/>
+            </w:pPr>
+            <w:r>
               <w:t xml:space="preserve">9.79</w:t>
             </w:r>
           </w:p>
@@ -1015,5 +815,19 @@
       <w:szCs w:val="28"/>
     </w:rPr>
   </w:style>
+  <w:style w:type="paragraph" w:styleId="TableCell">
+    <w:name w:val="表格单元格"/>
+    <w:basedOn w:val="Normal"/>
+    <w:qFormat/>
+    <w:pPr>
+      <w:spacing w:line="560" w:lineRule="exact"/>
+      <w:jc w:val="center"/>
+    </w:pPr>
+    <w:rPr>
+      <w:rFonts w:ascii="Times New Roman" w:eastAsia="仿宋_GB2312" w:hAnsi="Times New Roman"/>
+      <w:sz w:val="24"/>
+      <w:szCs w:val="24"/>
+    </w:rPr>
+  </w:style>
 </w:styles>
 </file>
</xml_diff>